<commit_message>
Started making the layout for the key findings and recommendations, as well as coloring the table with the categories.
</commit_message>
<xml_diff>
--- a/reports/generated reports/Toronto_Food_Trucks_Copied_And_Pasted_Report.docx
+++ b/reports/generated reports/Toronto_Food_Trucks_Copied_And_Pasted_Report.docx
@@ -61,6 +61,7 @@
         <w:tc>
           <w:tcPr>
             <w:tcW w:type="dxa" w:w="1440"/>
+            <w:shd w:fill="078701"/>
           </w:tcPr>
           <w:p>
             <w:r>
@@ -83,6 +84,7 @@
         <w:tc>
           <w:tcPr>
             <w:tcW w:type="dxa" w:w="1440"/>
+            <w:shd w:fill="078701"/>
           </w:tcPr>
           <w:p>
             <w:r>
@@ -105,6 +107,7 @@
         <w:tc>
           <w:tcPr>
             <w:tcW w:type="dxa" w:w="1440"/>
+            <w:shd w:fill="078701"/>
           </w:tcPr>
           <w:p>
             <w:r>
@@ -127,6 +130,7 @@
         <w:tc>
           <w:tcPr>
             <w:tcW w:type="dxa" w:w="1440"/>
+            <w:shd w:fill="078701"/>
           </w:tcPr>
           <w:p>
             <w:r>
@@ -149,6 +153,7 @@
         <w:tc>
           <w:tcPr>
             <w:tcW w:type="dxa" w:w="1440"/>
+            <w:shd w:fill="078701"/>
           </w:tcPr>
           <w:p>
             <w:r>
@@ -171,6 +176,7 @@
         <w:tc>
           <w:tcPr>
             <w:tcW w:type="dxa" w:w="1440"/>
+            <w:shd w:fill="078701"/>
           </w:tcPr>
           <w:p>
             <w:r>
@@ -193,6 +199,7 @@
         <w:tc>
           <w:tcPr>
             <w:tcW w:type="dxa" w:w="1440"/>
+            <w:shd w:fill="A61B00"/>
           </w:tcPr>
           <w:p>
             <w:r>
@@ -215,6 +222,7 @@
         <w:tc>
           <w:tcPr>
             <w:tcW w:type="dxa" w:w="1440"/>
+            <w:shd w:fill="A61B00"/>
           </w:tcPr>
           <w:p>
             <w:r>
@@ -237,6 +245,7 @@
         <w:tc>
           <w:tcPr>
             <w:tcW w:type="dxa" w:w="1440"/>
+            <w:shd w:fill="A61B00"/>
           </w:tcPr>
           <w:p>
             <w:r>
@@ -259,6 +268,7 @@
         <w:tc>
           <w:tcPr>
             <w:tcW w:type="dxa" w:w="1440"/>
+            <w:shd w:fill="A61B00"/>
           </w:tcPr>
           <w:p>
             <w:r>
@@ -281,6 +291,7 @@
         <w:tc>
           <w:tcPr>
             <w:tcW w:type="dxa" w:w="1440"/>
+            <w:shd w:fill="078701"/>
           </w:tcPr>
           <w:p>
             <w:r>
@@ -303,6 +314,7 @@
         <w:tc>
           <w:tcPr>
             <w:tcW w:type="dxa" w:w="1440"/>
+            <w:shd w:fill="078701"/>
           </w:tcPr>
           <w:p>
             <w:r>
@@ -325,6 +337,7 @@
         <w:tc>
           <w:tcPr>
             <w:tcW w:type="dxa" w:w="1440"/>
+            <w:shd w:fill="A61B00"/>
           </w:tcPr>
           <w:p>
             <w:r>
@@ -347,6 +360,7 @@
         <w:tc>
           <w:tcPr>
             <w:tcW w:type="dxa" w:w="1440"/>
+            <w:shd w:fill="078701"/>
           </w:tcPr>
           <w:p>
             <w:r>
@@ -369,6 +383,7 @@
         <w:tc>
           <w:tcPr>
             <w:tcW w:type="dxa" w:w="1440"/>
+            <w:shd w:fill="078701"/>
           </w:tcPr>
           <w:p>
             <w:r>
@@ -391,6 +406,7 @@
         <w:tc>
           <w:tcPr>
             <w:tcW w:type="dxa" w:w="1440"/>
+            <w:shd w:fill="A61B00"/>
           </w:tcPr>
           <w:p>
             <w:r>
@@ -413,6 +429,7 @@
         <w:tc>
           <w:tcPr>
             <w:tcW w:type="dxa" w:w="1440"/>
+            <w:shd w:fill="078701"/>
           </w:tcPr>
           <w:p>
             <w:r>
@@ -435,6 +452,7 @@
         <w:tc>
           <w:tcPr>
             <w:tcW w:type="dxa" w:w="1440"/>
+            <w:shd w:fill="A61B00"/>
           </w:tcPr>
           <w:p>
             <w:r>
@@ -457,6 +475,7 @@
         <w:tc>
           <w:tcPr>
             <w:tcW w:type="dxa" w:w="1440"/>
+            <w:shd w:fill="078701"/>
           </w:tcPr>
           <w:p>
             <w:r>
@@ -479,6 +498,7 @@
         <w:tc>
           <w:tcPr>
             <w:tcW w:type="dxa" w:w="1440"/>
+            <w:shd w:fill="A61B00"/>
           </w:tcPr>
           <w:p>
             <w:r>
@@ -501,6 +521,7 @@
         <w:tc>
           <w:tcPr>
             <w:tcW w:type="dxa" w:w="1440"/>
+            <w:shd w:fill="A61B00"/>
           </w:tcPr>
           <w:p>
             <w:r>
@@ -523,6 +544,7 @@
         <w:tc>
           <w:tcPr>
             <w:tcW w:type="dxa" w:w="1440"/>
+            <w:shd w:fill="A61B00"/>
           </w:tcPr>
           <w:p>
             <w:r>
@@ -545,6 +567,7 @@
         <w:tc>
           <w:tcPr>
             <w:tcW w:type="dxa" w:w="1440"/>
+            <w:shd w:fill="078701"/>
           </w:tcPr>
           <w:p>
             <w:r>
@@ -567,6 +590,7 @@
         <w:tc>
           <w:tcPr>
             <w:tcW w:type="dxa" w:w="1440"/>
+            <w:shd w:fill="A61B00"/>
           </w:tcPr>
           <w:p>
             <w:r>
@@ -589,6 +613,7 @@
         <w:tc>
           <w:tcPr>
             <w:tcW w:type="dxa" w:w="1440"/>
+            <w:shd w:fill="A61B00"/>
           </w:tcPr>
           <w:p>
             <w:r>
@@ -611,6 +636,7 @@
         <w:tc>
           <w:tcPr>
             <w:tcW w:type="dxa" w:w="1440"/>
+            <w:shd w:fill="A61B00"/>
           </w:tcPr>
           <w:p>
             <w:r>
@@ -633,6 +659,7 @@
         <w:tc>
           <w:tcPr>
             <w:tcW w:type="dxa" w:w="1440"/>
+            <w:shd w:fill="078701"/>
           </w:tcPr>
           <w:p>
             <w:r>
@@ -655,6 +682,7 @@
         <w:tc>
           <w:tcPr>
             <w:tcW w:type="dxa" w:w="1440"/>
+            <w:shd w:fill="078701"/>
           </w:tcPr>
           <w:p>
             <w:r>
@@ -677,6 +705,7 @@
         <w:tc>
           <w:tcPr>
             <w:tcW w:type="dxa" w:w="1440"/>
+            <w:shd w:fill="078701"/>
           </w:tcPr>
           <w:p>
             <w:r>
@@ -699,6 +728,7 @@
         <w:tc>
           <w:tcPr>
             <w:tcW w:type="dxa" w:w="1440"/>
+            <w:shd w:fill="078701"/>
           </w:tcPr>
           <w:p>
             <w:r>
@@ -708,6 +738,437 @@
         </w:tc>
       </w:tr>
     </w:tbl>
+    <w:p>
+      <w:pPr>
+        <w:pStyle w:val="Heading1"/>
+      </w:pPr>
+      <w:r>
+        <w:t>Key Findings</w:t>
+      </w:r>
+    </w:p>
+    <w:p>
+      <w:r>
+        <w:t>the certificate must be sent by email to mlsroadallowance@toronto.ca directly from the insurance representative.</w:t>
+      </w:r>
+    </w:p>
+    <w:p>
+      <w:r>
+        <w:t>please contact mlsroadallowance@toronto.ca for the next weekday availability.</w:t>
+      </w:r>
+    </w:p>
+    <w:p>
+      <w:r>
+        <w:t>please contact mlsroadallowance@toronto.ca.</w:t>
+      </w:r>
+    </w:p>
+    <w:p>
+      <w:r>
+        <w:t>if you have not received your renewal notice and your licence is about to expire, please contact us at mlsbusinesslicence@toronto.ca for additional information.</w:t>
+      </w:r>
+    </w:p>
+    <w:p>
+      <w:r>
+        <w:t>a signed and completed motorized refreshment vehicle owner supporting documents checklist pdf.</w:t>
+      </w:r>
+    </w:p>
+    <w:p>
+      <w:r>
+        <w:t>please have all required documents ready to upload before starting the application, as it requires 10-15 minutes to complete and cannot be saved.</w:t>
+      </w:r>
+    </w:p>
+    <w:p>
+      <w:r>
+        <w:t>how to apply</w:t>
+      </w:r>
+    </w:p>
+    <w:p>
+      <w:r>
+        <w:t>please review ‘how to apply’ instructions above, for submitting a motorized refreshment vehicle owner business licence.</w:t>
+      </w:r>
+    </w:p>
+    <w:p>
+      <w:r>
+        <w:t>download a step by step guide pdf on how to submit a new application.</w:t>
+      </w:r>
+    </w:p>
+    <w:p>
+      <w:r>
+        <w:t>the city is conducting a review of the street vending bylaws to create more opportunities for street vendors and performers.</w:t>
+      </w:r>
+    </w:p>
+    <w:p>
+      <w:r>
+        <w:t>if you fail to renew your licence according to the bylaw, your licence will be cancelled and you will have to reapply.</w:t>
+      </w:r>
+    </w:p>
+    <w:p>
+      <w:r>
+        <w:t>these vendors are required to abide by all relevant parking regulations, and pay for parking.</w:t>
+      </w:r>
+    </w:p>
+    <w:p>
+      <w:r>
+        <w:t>been convicted of five or more offences under chapter 545 or 546 of the toronto municipal code in the preceding three years;</w:t>
+      </w:r>
+    </w:p>
+    <w:p>
+      <w:r>
+        <w:t>parking meter fees must be paid</w:t>
+      </w:r>
+    </w:p>
+    <w:p>
+      <w:r>
+        <w:t>licence application fees can be paid online or by sending a cheque.</w:t>
+      </w:r>
+    </w:p>
+    <w:p>
+      <w:r>
+        <w:t>fees</w:t>
+      </w:r>
+    </w:p>
+    <w:p>
+      <w:r>
+        <w:t>application fees and licence fees must be paid online.</w:t>
+      </w:r>
+    </w:p>
+    <w:p>
+      <w:r>
+        <w:t>application fee: $275.46 (inclusive of hst)</w:t>
+      </w:r>
+    </w:p>
+    <w:p>
+      <w:r>
+        <w:t>the application fee is non-refundable and is required upon submittal of a complete application.</w:t>
+      </w:r>
+    </w:p>
+    <w:p>
+      <w:r>
+        <w:t>licence fee: $1,132.37 (inclusive of hst)</w:t>
+      </w:r>
+    </w:p>
+    <w:p>
+      <w:r>
+        <w:t>the licence fee is due upon approval of the application.</w:t>
+      </w:r>
+    </w:p>
+    <w:p>
+      <w:r>
+        <w:t>total fee (application fee + licence fee): $1,407.83</w:t>
+      </w:r>
+    </w:p>
+    <w:p>
+      <w:r>
+        <w:t>permit fee</w:t>
+      </w:r>
+    </w:p>
+    <w:p>
+      <w:r>
+        <w:t>the renewal fee is $936.45</w:t>
+      </w:r>
+    </w:p>
+    <w:p>
+      <w:r>
+        <w:t>licence renewal fees can be made in-person, paid online or by sending a cheque.</w:t>
+      </w:r>
+    </w:p>
+    <w:p>
+      <w:r>
+        <w:t>any overdue by-law fines, unless the applicant provides proof that such fines have been subsequently paid.</w:t>
+      </w:r>
+    </w:p>
+    <w:p>
+      <w:r>
+        <w:t>a copy of provincial business name certificate and registration (opens in new window) or signed franchise agreement pdf.</w:t>
+      </w:r>
+    </w:p>
+    <w:p>
+      <w:r>
+        <w:t>the city is conducting a review of the street vending bylaws to create more opportunities for street vendors and performers.</w:t>
+      </w:r>
+    </w:p>
+    <w:p>
+      <w:r>
+        <w:t>on public roads (with a mobile vending permit) pay ‘n display</w:t>
+      </w:r>
+    </w:p>
+    <w:p>
+      <w:r>
+        <w:t>you must obtain this licence before applying for a mobile vending permit</w:t>
+      </w:r>
+    </w:p>
+    <w:p>
+      <w:r>
+        <w:t>mobile vending permit</w:t>
+      </w:r>
+    </w:p>
+    <w:p>
+      <w:r>
+        <w:t>vendors are encouraged to identify areas of the road, such as non pay and display stations and lay-bys that may be suitable for mobile vending.</w:t>
+      </w:r>
+    </w:p>
+    <w:p>
+      <w:r>
+        <w:t>upon review, these areas may be designated as mobile vending zones, where food trucks could operate for up to five hours at a time.</w:t>
+      </w:r>
+    </w:p>
+    <w:p>
+      <w:r>
+        <w:t>a motorized refreshment vehicle business licence (food/ice cream truck) is required in order to qualify for the mobile vending permit.</w:t>
+      </w:r>
+    </w:p>
+    <w:p>
+      <w:r>
+        <w:t>without a business licence (starting with v15) an application for mobile vending permit will not be processed.</w:t>
+      </w:r>
+    </w:p>
+    <w:p>
+      <w:r>
+        <w:t>upon review, these areas may be designated as mobile vending zones, where food trucks could operate for up to five hours at a time.</w:t>
+      </w:r>
+    </w:p>
+    <w:p>
+      <w:r>
+        <w:t>been convicted of any of the following offences under the highway traffic act in the preceding five years:</w:t>
+      </w:r>
+    </w:p>
+    <w:p>
+      <w:r>
+        <w:t>maximum of five hours at any one time</w:t>
+      </w:r>
+    </w:p>
+    <w:p>
+      <w:r>
+        <w:t>private property and commercial parking lots with the permission of the owner in areas that allow food trucks</w:t>
+      </w:r>
+    </w:p>
+    <w:p>
+      <w:r>
+        <w:t>30 linear metres from an open and operating restaurant</w:t>
+      </w:r>
+    </w:p>
+    <w:p>
+      <w:r>
+        <w:t>no more than two food trucks per block</w:t>
+      </w:r>
+    </w:p>
+    <w:p>
+      <w:r>
+        <w:t>green p parking lots (with a green p permit) contact: events@greenpmobility.com</w:t>
+      </w:r>
+    </w:p>
+    <w:p>
+      <w:r>
+        <w:t>if you have already submitted an application and a representative has contacted you about uploading additional documents, you may do so using the upload token provided to you by the representative.</w:t>
+      </w:r>
+    </w:p>
+    <w:p>
+      <w:r>
+        <w:t>please contact mlsroadallowance@toronto.ca for the next weekday availability.</w:t>
+      </w:r>
+    </w:p>
+    <w:p>
+      <w:r>
+        <w:t>please contact mlsroadallowance@toronto.ca.</w:t>
+      </w:r>
+    </w:p>
+    <w:p>
+      <w:r>
+        <w:t>if you have not received your renewal notice and your licence is about to expire, please contact us at mlsbusinesslicence@toronto.ca for additional information.</w:t>
+      </w:r>
+    </w:p>
+    <w:p>
+      <w:r>
+        <w:t>you can arrange this by calling 311 or the health connection line at 416-338-7600.</w:t>
+      </w:r>
+    </w:p>
+    <w:p>
+      <w:r>
+        <w:t>ml&amp;s shall deny an application for, or a renewal for any business, trade or calling for which a vehicle and it’s driver are licenced or required to be licenced by the city under this chapter and for which a licencesee is required to hold a valid provincial driver’s licence under this chapter where the licensee or applicant has:</w:t>
+      </w:r>
+    </w:p>
+    <w:p>
+      <w:r>
+        <w:t>a copy of articles of incorporation (certificate and articles) (note: if there has been a change to the list of officers and directors, please provide a current corporate profile report);</w:t>
+      </w:r>
+    </w:p>
+    <w:p>
+      <w:r>
+        <w:t>the annual return for corporation form, signed by an officer or director pdf, which lists all current directors &amp; officers of the corporation;</w:t>
+      </w:r>
+    </w:p>
+    <w:p>
+      <w:r>
+        <w:t>two pieces of government-issued identification (one must be photo id) for each officer/director;</w:t>
+      </w:r>
+    </w:p>
+    <w:p>
+      <w:r>
+        <w:t>a criminal record and judicial matters check for each officer/director issued by a canadian police service within 280 days prior to the application.</w:t>
+      </w:r>
+    </w:p>
+    <w:p>
+      <w:r>
+        <w:t>in-person services are available at the licence and permit issuing office, 850 coxwell avenue, 3rd floor.</w:t>
+      </w:r>
+    </w:p>
+    <w:p>
+      <w:r>
+        <w:t>the office is closed from 12:30pm – 1:30pm daily.</w:t>
+      </w:r>
+    </w:p>
+    <w:p>
+      <w:r>
+        <w:t>in-person services are available at the licence and permit issuing office, 850 coxwell avenue, 3rd floor.</w:t>
+      </w:r>
+    </w:p>
+    <w:p>
+      <w:r>
+        <w:t>please note office hours:</w:t>
+      </w:r>
+    </w:p>
+    <w:p>
+      <w:r>
+        <w:t>the office is closed from 12:30–1:30pm daily.</w:t>
+      </w:r>
+    </w:p>
+    <w:p>
+      <w:r>
+        <w:t>failing to stop for a school bus or when signaled or asked by a police officer;</w:t>
+      </w:r>
+    </w:p>
+    <w:p>
+      <w:r>
+        <w:t>walk-in renewal services are available monday, wednesday and thursday at the licence and permit issuing office, 850 coxwell avenue, 3rd floor starting at 8:30am subject to capacity.</w:t>
+      </w:r>
+    </w:p>
+    <w:p>
+      <w:r>
+        <w:t>the office is closed from 12:30pm – 1:30pm daily.</w:t>
+      </w:r>
+    </w:p>
+    <w:p>
+      <w:r>
+        <w:t>the certificate must be sent by email to mlsroadallowance@toronto.ca directly from the insurance representative.</w:t>
+      </w:r>
+    </w:p>
+    <w:p>
+      <w:r>
+        <w:t>despite these screening criteria, if a licence has been previously issued or renewed and the applicant’s or licensee’s record discloses no new breach of the screening criteria, the licence may be issued or renewed without the matter being referred to the toronto licensing tribunal.</w:t>
+      </w:r>
+    </w:p>
+    <w:p>
+      <w:r>
+        <w:t>sin card (social insurance number)</w:t>
+      </w:r>
+    </w:p>
+    <w:p>
+      <w:r>
+        <w:t>a completed and signed certificate of insurance.</w:t>
+      </w:r>
+    </w:p>
+    <w:p>
+      <w:r>
+        <w:t>certificate of insurance</w:t>
+      </w:r>
+    </w:p>
+    <w:p>
+      <w:r>
+        <w:t>applicants must provide proof of $1,000,000 insurance personal liability &amp; property damage (pl/pd) insurance.</w:t>
+      </w:r>
+    </w:p>
+    <w:p>
+      <w:r>
+        <w:t>the completed certificate of insurance  pdfmust be signed and stamped by the insurer.</w:t>
+      </w:r>
+    </w:p>
+    <w:p>
+      <w:r>
+        <w:t>insurance</w:t>
+      </w:r>
+    </w:p>
+    <w:p>
+      <w:r>
+        <w:t>applicants must provide proof of $2,000,000 in commercial general liability (cgl) insurance.</w:t>
+      </w:r>
+    </w:p>
+    <w:p>
+      <w:r>
+        <w:t>the completed certificate of insurance pdf must be signed and stamped by the insurer.</w:t>
+      </w:r>
+    </w:p>
+    <w:p>
+      <w:r>
+        <w:t>the certificate must be sent by email to mlsroadallowance@toronto.ca directly from the insurance representative.</w:t>
+      </w:r>
+    </w:p>
+    <w:p>
+      <w:r>
+        <w:t>certificate of insurance pdf</w:t>
+      </w:r>
+    </w:p>
+    <w:p>
+      <w:r>
+        <w:t>a completed and signed certificate of insurance.</w:t>
+      </w:r>
+    </w:p>
+    <w:p>
+      <w:r>
+        <w:t>certificate of insurance</w:t>
+      </w:r>
+    </w:p>
+    <w:p>
+      <w:r>
+        <w:t>the completed certificate of insurance  pdfmust be signed and stamped by the insurer.</w:t>
+      </w:r>
+    </w:p>
+    <w:p>
+      <w:r>
+        <w:t>the completed certificate of insurance pdf must be signed and stamped by the insurer.</w:t>
+      </w:r>
+    </w:p>
+    <w:p>
+      <w:r>
+        <w:t>certificate of insurance pdf</w:t>
+      </w:r>
+    </w:p>
+    <w:p>
+      <w:r>
+        <w:t>a copy of provincial business name certificate and registration (opens in new window) or signed franchise agreement pdf.</w:t>
+      </w:r>
+    </w:p>
+    <w:p>
+      <w:r>
+        <w:t>business name: 10 cm.</w:t>
+      </w:r>
+    </w:p>
+    <w:p>
+      <w:r>
+        <w:t>plate number: 15 cm.</w:t>
+      </w:r>
+    </w:p>
+    <w:p>
+      <w:r>
+        <w:t>painted with contrasting colours on both sides of vehicle</w:t>
+      </w:r>
+    </w:p>
+    <w:p>
+      <w:r>
+        <w:t>painted with contrasting colours on both sides of vehicle</w:t>
+      </w:r>
+    </w:p>
+    <w:p>
+      <w:r>
+        <w:t>painted with contrasting colours on both sides of vehicle</w:t>
+      </w:r>
+    </w:p>
+    <w:p>
+      <w:pPr>
+        <w:pStyle w:val="Heading1"/>
+      </w:pPr>
+      <w:r>
+        <w:t>Recommendations</w:t>
+      </w:r>
+    </w:p>
     <w:sectPr>
       <w:pgSz w:w="12240" w:h="15840"/>
       <w:pgMar w:top="1440" w:right="1800" w:bottom="1440" w:left="1800" w:header="720" w:footer="720" w:gutter="0"/>

</xml_diff>

<commit_message>
Reports are in word format, will add PDF later. Recommendations section now adds the missing categories in human language and exact dupes shouldn't happen anymore in the key findings section.
</commit_message>
<xml_diff>
--- a/reports/generated reports/Toronto_Food_Trucks_Copied_And_Pasted_Report.docx
+++ b/reports/generated reports/Toronto_Food_Trucks_Copied_And_Pasted_Report.docx
@@ -883,11 +883,6 @@
     </w:p>
     <w:p>
       <w:r>
-        <w:t>the city is conducting a review of the street vending bylaws to create more opportunities for street vendors and performers.</w:t>
-      </w:r>
-    </w:p>
-    <w:p>
-      <w:r>
         <w:t>on public roads (with a mobile vending permit) pay ‘n display</w:t>
       </w:r>
     </w:p>
@@ -923,11 +918,6 @@
     </w:p>
     <w:p>
       <w:r>
-        <w:t>upon review, these areas may be designated as mobile vending zones, where food trucks could operate for up to five hours at a time.</w:t>
-      </w:r>
-    </w:p>
-    <w:p>
-      <w:r>
         <w:t>been convicted of any of the following offences under the highway traffic act in the preceding five years:</w:t>
       </w:r>
     </w:p>
@@ -959,21 +949,6 @@
     <w:p>
       <w:r>
         <w:t>if you have already submitted an application and a representative has contacted you about uploading additional documents, you may do so using the upload token provided to you by the representative.</w:t>
-      </w:r>
-    </w:p>
-    <w:p>
-      <w:r>
-        <w:t>please contact mlsroadallowance@toronto.ca for the next weekday availability.</w:t>
-      </w:r>
-    </w:p>
-    <w:p>
-      <w:r>
-        <w:t>please contact mlsroadallowance@toronto.ca.</w:t>
-      </w:r>
-    </w:p>
-    <w:p>
-      <w:r>
-        <w:t>if you have not received your renewal notice and your licence is about to expire, please contact us at mlsbusinesslicence@toronto.ca for additional information.</w:t>
       </w:r>
     </w:p>
     <w:p>
@@ -1018,11 +993,6 @@
     </w:p>
     <w:p>
       <w:r>
-        <w:t>in-person services are available at the licence and permit issuing office, 850 coxwell avenue, 3rd floor.</w:t>
-      </w:r>
-    </w:p>
-    <w:p>
-      <w:r>
         <w:t>please note office hours:</w:t>
       </w:r>
     </w:p>
@@ -1039,16 +1009,6 @@
     <w:p>
       <w:r>
         <w:t>walk-in renewal services are available monday, wednesday and thursday at the licence and permit issuing office, 850 coxwell avenue, 3rd floor starting at 8:30am subject to capacity.</w:t>
-      </w:r>
-    </w:p>
-    <w:p>
-      <w:r>
-        <w:t>the office is closed from 12:30pm – 1:30pm daily.</w:t>
-      </w:r>
-    </w:p>
-    <w:p>
-      <w:r>
-        <w:t>the certificate must be sent by email to mlsroadallowance@toronto.ca directly from the insurance representative.</w:t>
       </w:r>
     </w:p>
     <w:p>
@@ -1098,42 +1058,7 @@
     </w:p>
     <w:p>
       <w:r>
-        <w:t>the certificate must be sent by email to mlsroadallowance@toronto.ca directly from the insurance representative.</w:t>
-      </w:r>
-    </w:p>
-    <w:p>
-      <w:r>
         <w:t>certificate of insurance pdf</w:t>
-      </w:r>
-    </w:p>
-    <w:p>
-      <w:r>
-        <w:t>a completed and signed certificate of insurance.</w:t>
-      </w:r>
-    </w:p>
-    <w:p>
-      <w:r>
-        <w:t>certificate of insurance</w:t>
-      </w:r>
-    </w:p>
-    <w:p>
-      <w:r>
-        <w:t>the completed certificate of insurance  pdfmust be signed and stamped by the insurer.</w:t>
-      </w:r>
-    </w:p>
-    <w:p>
-      <w:r>
-        <w:t>the completed certificate of insurance pdf must be signed and stamped by the insurer.</w:t>
-      </w:r>
-    </w:p>
-    <w:p>
-      <w:r>
-        <w:t>certificate of insurance pdf</w:t>
-      </w:r>
-    </w:p>
-    <w:p>
-      <w:r>
-        <w:t>a copy of provincial business name certificate and registration (opens in new window) or signed franchise agreement pdf.</w:t>
       </w:r>
     </w:p>
     <w:p>
@@ -1152,21 +1077,76 @@
       </w:r>
     </w:p>
     <w:p>
-      <w:r>
-        <w:t>painted with contrasting colours on both sides of vehicle</w:t>
-      </w:r>
-    </w:p>
-    <w:p>
-      <w:r>
-        <w:t>painted with contrasting colours on both sides of vehicle</w:t>
-      </w:r>
-    </w:p>
-    <w:p>
       <w:pPr>
         <w:pStyle w:val="Heading1"/>
       </w:pPr>
       <w:r>
         <w:t>Recommendations</w:t>
+      </w:r>
+    </w:p>
+    <w:p>
+      <w:r>
+        <w:t>Find more information for provincial food business license.</w:t>
+      </w:r>
+    </w:p>
+    <w:p>
+      <w:r>
+        <w:t>Find more information for municipal business license.</w:t>
+      </w:r>
+    </w:p>
+    <w:p>
+      <w:r>
+        <w:t>Find more information for municipal food business license.</w:t>
+      </w:r>
+    </w:p>
+    <w:p>
+      <w:r>
+        <w:t>Find more information for retail license for CPG.</w:t>
+      </w:r>
+    </w:p>
+    <w:p>
+      <w:r>
+        <w:t>Find more information for noise bylaws.</w:t>
+      </w:r>
+    </w:p>
+    <w:p>
+      <w:r>
+        <w:t>Find more information for branded consumer goods.</w:t>
+      </w:r>
+    </w:p>
+    <w:p>
+      <w:r>
+        <w:t>Find more information for proximity regulations.</w:t>
+      </w:r>
+    </w:p>
+    <w:p>
+      <w:r>
+        <w:t>Find more information for min distance to food truck.</w:t>
+      </w:r>
+    </w:p>
+    <w:p>
+      <w:r>
+        <w:t>Find more information for non-food service proximity restrictions.</w:t>
+      </w:r>
+    </w:p>
+    <w:p>
+      <w:r>
+        <w:t>Find more information for min distance proximity from other business.</w:t>
+      </w:r>
+    </w:p>
+    <w:p>
+      <w:r>
+        <w:t>Find more information for parking locations.</w:t>
+      </w:r>
+    </w:p>
+    <w:p>
+      <w:r>
+        <w:t>Find more information for additional private restrictions.</w:t>
+      </w:r>
+    </w:p>
+    <w:p>
+      <w:r>
+        <w:t>Find more information for name of local authority.</w:t>
       </w:r>
     </w:p>
     <w:sectPr>

</xml_diff>

<commit_message>
Added proper punctuation to categories and most of the key finding lines. Also filtered out some of the key findings that were just terms with no useful information via word count (e.g., a line with just 'fee' on it). Also changed the tables to have Found or Missing instead of + or -.
</commit_message>
<xml_diff>
--- a/reports/generated reports/Toronto_Food_Trucks_Copied_And_Pasted_Report.docx
+++ b/reports/generated reports/Toronto_Food_Trucks_Copied_And_Pasted_Report.docx
@@ -54,7 +54,7 @@
           </w:tcPr>
           <w:p>
             <w:r>
-              <w:t>webpage</w:t>
+              <w:t>Webpage</w:t>
             </w:r>
           </w:p>
         </w:tc>
@@ -65,7 +65,7 @@
           </w:tcPr>
           <w:p>
             <w:r>
-              <w:t>+</w:t>
+              <w:t>Found</w:t>
             </w:r>
           </w:p>
         </w:tc>
@@ -77,7 +77,7 @@
           </w:tcPr>
           <w:p>
             <w:r>
-              <w:t>checklist</w:t>
+              <w:t>Checklist</w:t>
             </w:r>
           </w:p>
         </w:tc>
@@ -88,7 +88,7 @@
           </w:tcPr>
           <w:p>
             <w:r>
-              <w:t>+</w:t>
+              <w:t>Found</w:t>
             </w:r>
           </w:p>
         </w:tc>
@@ -100,7 +100,7 @@
           </w:tcPr>
           <w:p>
             <w:r>
-              <w:t>guide to license</w:t>
+              <w:t>Guide to license</w:t>
             </w:r>
           </w:p>
         </w:tc>
@@ -111,7 +111,7 @@
           </w:tcPr>
           <w:p>
             <w:r>
-              <w:t>+</w:t>
+              <w:t>Found</w:t>
             </w:r>
           </w:p>
         </w:tc>
@@ -123,7 +123,7 @@
           </w:tcPr>
           <w:p>
             <w:r>
-              <w:t>bylaws</w:t>
+              <w:t>Bylaws</w:t>
             </w:r>
           </w:p>
         </w:tc>
@@ -134,7 +134,7 @@
           </w:tcPr>
           <w:p>
             <w:r>
-              <w:t>+</w:t>
+              <w:t>Found</w:t>
             </w:r>
           </w:p>
         </w:tc>
@@ -146,7 +146,7 @@
           </w:tcPr>
           <w:p>
             <w:r>
-              <w:t>penalties</w:t>
+              <w:t>Penalties</w:t>
             </w:r>
           </w:p>
         </w:tc>
@@ -157,7 +157,7 @@
           </w:tcPr>
           <w:p>
             <w:r>
-              <w:t>+</w:t>
+              <w:t>Found</w:t>
             </w:r>
           </w:p>
         </w:tc>
@@ -169,7 +169,7 @@
           </w:tcPr>
           <w:p>
             <w:r>
-              <w:t>provincial business license</w:t>
+              <w:t>Provincial business license</w:t>
             </w:r>
           </w:p>
         </w:tc>
@@ -180,7 +180,7 @@
           </w:tcPr>
           <w:p>
             <w:r>
-              <w:t>+</w:t>
+              <w:t>Found</w:t>
             </w:r>
           </w:p>
         </w:tc>
@@ -192,7 +192,7 @@
           </w:tcPr>
           <w:p>
             <w:r>
-              <w:t>provincial food business license</w:t>
+              <w:t>Provincial food business license</w:t>
             </w:r>
           </w:p>
         </w:tc>
@@ -203,7 +203,7 @@
           </w:tcPr>
           <w:p>
             <w:r>
-              <w:t>-</w:t>
+              <w:t>Missing</w:t>
             </w:r>
           </w:p>
         </w:tc>
@@ -215,7 +215,7 @@
           </w:tcPr>
           <w:p>
             <w:r>
-              <w:t>municipal business license</w:t>
+              <w:t>Municipal business license</w:t>
             </w:r>
           </w:p>
         </w:tc>
@@ -226,7 +226,7 @@
           </w:tcPr>
           <w:p>
             <w:r>
-              <w:t>-</w:t>
+              <w:t>Missing</w:t>
             </w:r>
           </w:p>
         </w:tc>
@@ -238,7 +238,7 @@
           </w:tcPr>
           <w:p>
             <w:r>
-              <w:t>municipal food business license</w:t>
+              <w:t>Municipal food business license</w:t>
             </w:r>
           </w:p>
         </w:tc>
@@ -249,7 +249,7 @@
           </w:tcPr>
           <w:p>
             <w:r>
-              <w:t>-</w:t>
+              <w:t>Missing</w:t>
             </w:r>
           </w:p>
         </w:tc>
@@ -261,7 +261,7 @@
           </w:tcPr>
           <w:p>
             <w:r>
-              <w:t>retail license for CPG</w:t>
+              <w:t>Retail license for cpg</w:t>
             </w:r>
           </w:p>
         </w:tc>
@@ -272,7 +272,7 @@
           </w:tcPr>
           <w:p>
             <w:r>
-              <w:t>-</w:t>
+              <w:t>Missing</w:t>
             </w:r>
           </w:p>
         </w:tc>
@@ -284,7 +284,7 @@
           </w:tcPr>
           <w:p>
             <w:r>
-              <w:t>curbside vending</w:t>
+              <w:t>Curbside vending</w:t>
             </w:r>
           </w:p>
         </w:tc>
@@ -295,7 +295,7 @@
           </w:tcPr>
           <w:p>
             <w:r>
-              <w:t>+</w:t>
+              <w:t>Found</w:t>
             </w:r>
           </w:p>
         </w:tc>
@@ -307,7 +307,7 @@
           </w:tcPr>
           <w:p>
             <w:r>
-              <w:t>parking fees</w:t>
+              <w:t>Parking fees</w:t>
             </w:r>
           </w:p>
         </w:tc>
@@ -318,7 +318,7 @@
           </w:tcPr>
           <w:p>
             <w:r>
-              <w:t>+</w:t>
+              <w:t>Found</w:t>
             </w:r>
           </w:p>
         </w:tc>
@@ -330,7 +330,7 @@
           </w:tcPr>
           <w:p>
             <w:r>
-              <w:t>noise bylaws</w:t>
+              <w:t>Noise bylaws</w:t>
             </w:r>
           </w:p>
         </w:tc>
@@ -341,7 +341,7 @@
           </w:tcPr>
           <w:p>
             <w:r>
-              <w:t>-</w:t>
+              <w:t>Missing</w:t>
             </w:r>
           </w:p>
         </w:tc>
@@ -353,7 +353,7 @@
           </w:tcPr>
           <w:p>
             <w:r>
-              <w:t>traffic bylaws</w:t>
+              <w:t>Traffic bylaws</w:t>
             </w:r>
           </w:p>
         </w:tc>
@@ -364,7 +364,7 @@
           </w:tcPr>
           <w:p>
             <w:r>
-              <w:t>+</w:t>
+              <w:t>Found</w:t>
             </w:r>
           </w:p>
         </w:tc>
@@ -376,7 +376,7 @@
           </w:tcPr>
           <w:p>
             <w:r>
-              <w:t>operation hours</w:t>
+              <w:t>Operation hours</w:t>
             </w:r>
           </w:p>
         </w:tc>
@@ -387,7 +387,7 @@
           </w:tcPr>
           <w:p>
             <w:r>
-              <w:t>+</w:t>
+              <w:t>Found</w:t>
             </w:r>
           </w:p>
         </w:tc>
@@ -399,7 +399,7 @@
           </w:tcPr>
           <w:p>
             <w:r>
-              <w:t>branded consumer goods</w:t>
+              <w:t>Branded consumer goods</w:t>
             </w:r>
           </w:p>
         </w:tc>
@@ -410,7 +410,7 @@
           </w:tcPr>
           <w:p>
             <w:r>
-              <w:t>-</w:t>
+              <w:t>Missing</w:t>
             </w:r>
           </w:p>
         </w:tc>
@@ -422,7 +422,7 @@
           </w:tcPr>
           <w:p>
             <w:r>
-              <w:t>private property operation</w:t>
+              <w:t>Private property operation</w:t>
             </w:r>
           </w:p>
         </w:tc>
@@ -433,7 +433,7 @@
           </w:tcPr>
           <w:p>
             <w:r>
-              <w:t>+</w:t>
+              <w:t>Found</w:t>
             </w:r>
           </w:p>
         </w:tc>
@@ -445,7 +445,7 @@
           </w:tcPr>
           <w:p>
             <w:r>
-              <w:t>proximity regulations</w:t>
+              <w:t>Proximity regulations</w:t>
             </w:r>
           </w:p>
         </w:tc>
@@ -456,7 +456,7 @@
           </w:tcPr>
           <w:p>
             <w:r>
-              <w:t>-</w:t>
+              <w:t>Missing</w:t>
             </w:r>
           </w:p>
         </w:tc>
@@ -468,7 +468,7 @@
           </w:tcPr>
           <w:p>
             <w:r>
-              <w:t>min distance to restaurant</w:t>
+              <w:t>Min distance to restaurant</w:t>
             </w:r>
           </w:p>
         </w:tc>
@@ -479,7 +479,7 @@
           </w:tcPr>
           <w:p>
             <w:r>
-              <w:t>+</w:t>
+              <w:t>Found</w:t>
             </w:r>
           </w:p>
         </w:tc>
@@ -491,7 +491,7 @@
           </w:tcPr>
           <w:p>
             <w:r>
-              <w:t>min distance to food truck</w:t>
+              <w:t>Min distance to food truck</w:t>
             </w:r>
           </w:p>
         </w:tc>
@@ -502,7 +502,7 @@
           </w:tcPr>
           <w:p>
             <w:r>
-              <w:t>-</w:t>
+              <w:t>Missing</w:t>
             </w:r>
           </w:p>
         </w:tc>
@@ -514,7 +514,7 @@
           </w:tcPr>
           <w:p>
             <w:r>
-              <w:t>non-food service proximity restrictions</w:t>
+              <w:t>Non-food service proximity restrictions</w:t>
             </w:r>
           </w:p>
         </w:tc>
@@ -525,7 +525,7 @@
           </w:tcPr>
           <w:p>
             <w:r>
-              <w:t>-</w:t>
+              <w:t>Missing</w:t>
             </w:r>
           </w:p>
         </w:tc>
@@ -537,7 +537,7 @@
           </w:tcPr>
           <w:p>
             <w:r>
-              <w:t>min distance proximity from other business</w:t>
+              <w:t>Min distance proximity from other business</w:t>
             </w:r>
           </w:p>
         </w:tc>
@@ -548,7 +548,7 @@
           </w:tcPr>
           <w:p>
             <w:r>
-              <w:t>-</w:t>
+              <w:t>Missing</w:t>
             </w:r>
           </w:p>
         </w:tc>
@@ -560,7 +560,7 @@
           </w:tcPr>
           <w:p>
             <w:r>
-              <w:t>num food trucks allowed in geographic area</w:t>
+              <w:t>Num food trucks allowed in geographic area</w:t>
             </w:r>
           </w:p>
         </w:tc>
@@ -571,7 +571,7 @@
           </w:tcPr>
           <w:p>
             <w:r>
-              <w:t>+</w:t>
+              <w:t>Found</w:t>
             </w:r>
           </w:p>
         </w:tc>
@@ -583,7 +583,7 @@
           </w:tcPr>
           <w:p>
             <w:r>
-              <w:t>parking locations</w:t>
+              <w:t>Parking locations</w:t>
             </w:r>
           </w:p>
         </w:tc>
@@ -594,7 +594,7 @@
           </w:tcPr>
           <w:p>
             <w:r>
-              <w:t>-</w:t>
+              <w:t>Missing</w:t>
             </w:r>
           </w:p>
         </w:tc>
@@ -606,7 +606,7 @@
           </w:tcPr>
           <w:p>
             <w:r>
-              <w:t>additional private restrictions</w:t>
+              <w:t>Additional private restrictions</w:t>
             </w:r>
           </w:p>
         </w:tc>
@@ -617,7 +617,7 @@
           </w:tcPr>
           <w:p>
             <w:r>
-              <w:t>-</w:t>
+              <w:t>Missing</w:t>
             </w:r>
           </w:p>
         </w:tc>
@@ -629,7 +629,7 @@
           </w:tcPr>
           <w:p>
             <w:r>
-              <w:t>name of local authority</w:t>
+              <w:t>Name of local authority</w:t>
             </w:r>
           </w:p>
         </w:tc>
@@ -640,7 +640,7 @@
           </w:tcPr>
           <w:p>
             <w:r>
-              <w:t>-</w:t>
+              <w:t>Missing</w:t>
             </w:r>
           </w:p>
         </w:tc>
@@ -652,7 +652,7 @@
           </w:tcPr>
           <w:p>
             <w:r>
-              <w:t>direct link to authority</w:t>
+              <w:t>Direct link to authority</w:t>
             </w:r>
           </w:p>
         </w:tc>
@@ -663,7 +663,7 @@
           </w:tcPr>
           <w:p>
             <w:r>
-              <w:t>+</w:t>
+              <w:t>Found</w:t>
             </w:r>
           </w:p>
         </w:tc>
@@ -675,7 +675,7 @@
           </w:tcPr>
           <w:p>
             <w:r>
-              <w:t>insurance requirements</w:t>
+              <w:t>Insurance requirements</w:t>
             </w:r>
           </w:p>
         </w:tc>
@@ -686,7 +686,7 @@
           </w:tcPr>
           <w:p>
             <w:r>
-              <w:t>+</w:t>
+              <w:t>Found</w:t>
             </w:r>
           </w:p>
         </w:tc>
@@ -698,7 +698,7 @@
           </w:tcPr>
           <w:p>
             <w:r>
-              <w:t>physical requirements for trucks</w:t>
+              <w:t>Physical requirements for trucks</w:t>
             </w:r>
           </w:p>
         </w:tc>
@@ -709,7 +709,7 @@
           </w:tcPr>
           <w:p>
             <w:r>
-              <w:t>+</w:t>
+              <w:t>Found</w:t>
             </w:r>
           </w:p>
         </w:tc>
@@ -721,7 +721,7 @@
           </w:tcPr>
           <w:p>
             <w:r>
-              <w:t>exterior appearance guidelines</w:t>
+              <w:t>Exterior appearance guidelines</w:t>
             </w:r>
           </w:p>
         </w:tc>
@@ -732,7 +732,7 @@
           </w:tcPr>
           <w:p>
             <w:r>
-              <w:t>+</w:t>
+              <w:t>Found</w:t>
             </w:r>
           </w:p>
         </w:tc>
@@ -748,332 +748,297 @@
     </w:p>
     <w:p>
       <w:r>
-        <w:t>the certificate must be sent by email to mlsroadallowance@toronto.ca directly from the insurance representative.</w:t>
+        <w:t>The certificate must be sent by email to mlsroadallowance@toronto.ca directly from the insurance representative.</w:t>
       </w:r>
     </w:p>
     <w:p>
       <w:r>
-        <w:t>please contact mlsroadallowance@toronto.ca for the next weekday availability.</w:t>
+        <w:t>Please contact mlsroadallowance@toronto.ca for the next weekday availability.</w:t>
       </w:r>
     </w:p>
     <w:p>
       <w:r>
-        <w:t>please contact mlsroadallowance@toronto.ca.</w:t>
+        <w:t>If you have not received your renewal notice and your licence is about to expire, please contact us at mlsbusinesslicence@toronto.ca for additional information.</w:t>
       </w:r>
     </w:p>
     <w:p>
       <w:r>
-        <w:t>if you have not received your renewal notice and your licence is about to expire, please contact us at mlsbusinesslicence@toronto.ca for additional information.</w:t>
+        <w:t>A signed and completed motorized refreshment vehicle owner supporting documents checklist pdf.</w:t>
       </w:r>
     </w:p>
     <w:p>
       <w:r>
-        <w:t>a signed and completed motorized refreshment vehicle owner supporting documents checklist pdf.</w:t>
+        <w:t>Please have all required documents ready to upload before starting the application, as it requires 10-15 minutes to complete and cannot be saved.</w:t>
       </w:r>
     </w:p>
     <w:p>
       <w:r>
-        <w:t>please have all required documents ready to upload before starting the application, as it requires 10-15 minutes to complete and cannot be saved.</w:t>
+        <w:t>Please review ‘how to apply’ instructions above, for submitting a motorized refreshment vehicle owner business licence.</w:t>
       </w:r>
     </w:p>
     <w:p>
       <w:r>
-        <w:t>how to apply</w:t>
+        <w:t>Download a step by step guide pdf on how to submit a new application.</w:t>
       </w:r>
     </w:p>
     <w:p>
       <w:r>
-        <w:t>please review ‘how to apply’ instructions above, for submitting a motorized refreshment vehicle owner business licence.</w:t>
+        <w:t>The city is conducting a review of the street vending bylaws to create more opportunities for street vendors and performers.</w:t>
       </w:r>
     </w:p>
     <w:p>
       <w:r>
-        <w:t>download a step by step guide pdf on how to submit a new application.</w:t>
+        <w:t>If you fail to renew your licence according to the bylaw, your licence will be cancelled and you will have to reapply.</w:t>
       </w:r>
     </w:p>
     <w:p>
       <w:r>
-        <w:t>the city is conducting a review of the street vending bylaws to create more opportunities for street vendors and performers.</w:t>
+        <w:t>These vendors are required to abide by all relevant parking regulations, and pay for parking.</w:t>
       </w:r>
     </w:p>
     <w:p>
       <w:r>
-        <w:t>if you fail to renew your licence according to the bylaw, your licence will be cancelled and you will have to reapply.</w:t>
+        <w:t>Been convicted of five or more offences under chapter 545 or 546 of the toronto municipal code in the preceding three years;.</w:t>
       </w:r>
     </w:p>
     <w:p>
       <w:r>
-        <w:t>these vendors are required to abide by all relevant parking regulations, and pay for parking.</w:t>
+        <w:t>Parking meter fees must be paid.</w:t>
       </w:r>
     </w:p>
     <w:p>
       <w:r>
-        <w:t>been convicted of five or more offences under chapter 545 or 546 of the toronto municipal code in the preceding three years;</w:t>
+        <w:t>Licence application fees can be paid online or by sending a cheque.</w:t>
       </w:r>
     </w:p>
     <w:p>
       <w:r>
-        <w:t>parking meter fees must be paid</w:t>
+        <w:t>Application fees and licence fees must be paid online.</w:t>
       </w:r>
     </w:p>
     <w:p>
       <w:r>
-        <w:t>licence application fees can be paid online or by sending a cheque.</w:t>
+        <w:t>Application fee: $275.46 (inclusive of hst).</w:t>
       </w:r>
     </w:p>
     <w:p>
       <w:r>
-        <w:t>fees</w:t>
+        <w:t>The application fee is non-refundable and is required upon submittal of a complete application.</w:t>
       </w:r>
     </w:p>
     <w:p>
       <w:r>
-        <w:t>application fees and licence fees must be paid online.</w:t>
+        <w:t>Licence fee: $1,132.37 (inclusive of hst).</w:t>
       </w:r>
     </w:p>
     <w:p>
       <w:r>
-        <w:t>application fee: $275.46 (inclusive of hst)</w:t>
+        <w:t>The licence fee is due upon approval of the application.</w:t>
       </w:r>
     </w:p>
     <w:p>
       <w:r>
-        <w:t>the application fee is non-refundable and is required upon submittal of a complete application.</w:t>
+        <w:t>Total fee (application fee + licence fee): $1,407.83.</w:t>
       </w:r>
     </w:p>
     <w:p>
       <w:r>
-        <w:t>licence fee: $1,132.37 (inclusive of hst)</w:t>
+        <w:t>The renewal fee is $936.45.</w:t>
       </w:r>
     </w:p>
     <w:p>
       <w:r>
-        <w:t>the licence fee is due upon approval of the application.</w:t>
+        <w:t>Licence renewal fees can be made in-person, paid online or by sending a cheque.</w:t>
       </w:r>
     </w:p>
     <w:p>
       <w:r>
-        <w:t>total fee (application fee + licence fee): $1,407.83</w:t>
+        <w:t>Any overdue by-law fines, unless the applicant provides proof that such fines have been subsequently paid.</w:t>
       </w:r>
     </w:p>
     <w:p>
       <w:r>
-        <w:t>permit fee</w:t>
+        <w:t>A copy of provincial business name certificate and registration (opens in new window) or signed franchise agreement pdf.</w:t>
       </w:r>
     </w:p>
     <w:p>
       <w:r>
-        <w:t>the renewal fee is $936.45</w:t>
+        <w:t>On public roads (with a mobile vending permit) pay ‘n display.</w:t>
       </w:r>
     </w:p>
     <w:p>
       <w:r>
-        <w:t>licence renewal fees can be made in-person, paid online or by sending a cheque.</w:t>
+        <w:t>You must obtain this licence before applying for a mobile vending permit.</w:t>
       </w:r>
     </w:p>
     <w:p>
       <w:r>
-        <w:t>any overdue by-law fines, unless the applicant provides proof that such fines have been subsequently paid.</w:t>
+        <w:t>Vendors are encouraged to identify areas of the road, such as non pay and display stations and lay-bys that may be suitable for mobile vending.</w:t>
       </w:r>
     </w:p>
     <w:p>
       <w:r>
-        <w:t>a copy of provincial business name certificate and registration (opens in new window) or signed franchise agreement pdf.</w:t>
+        <w:t>Upon review, these areas may be designated as mobile vending zones, where food trucks could operate for up to five hours at a time.</w:t>
       </w:r>
     </w:p>
     <w:p>
       <w:r>
-        <w:t>on public roads (with a mobile vending permit) pay ‘n display</w:t>
+        <w:t>A motorized refreshment vehicle business licence (food/ice cream truck) is required in order to qualify for the mobile vending permit.</w:t>
       </w:r>
     </w:p>
     <w:p>
       <w:r>
-        <w:t>you must obtain this licence before applying for a mobile vending permit</w:t>
+        <w:t>Without a business licence (starting with v15) an application for mobile vending permit will not be processed.</w:t>
       </w:r>
     </w:p>
     <w:p>
       <w:r>
-        <w:t>mobile vending permit</w:t>
+        <w:t>Been convicted of any of the following offences under the highway traffic act in the preceding five years:.</w:t>
       </w:r>
     </w:p>
     <w:p>
       <w:r>
-        <w:t>vendors are encouraged to identify areas of the road, such as non pay and display stations and lay-bys that may be suitable for mobile vending.</w:t>
+        <w:t>Maximum of five hours at any one time.</w:t>
       </w:r>
     </w:p>
     <w:p>
       <w:r>
-        <w:t>upon review, these areas may be designated as mobile vending zones, where food trucks could operate for up to five hours at a time.</w:t>
+        <w:t>Private property and commercial parking lots with the permission of the owner in areas that allow food trucks.</w:t>
       </w:r>
     </w:p>
     <w:p>
       <w:r>
-        <w:t>a motorized refreshment vehicle business licence (food/ice cream truck) is required in order to qualify for the mobile vending permit.</w:t>
+        <w:t>30 linear metres from an open and operating restaurant.</w:t>
       </w:r>
     </w:p>
     <w:p>
       <w:r>
-        <w:t>without a business licence (starting with v15) an application for mobile vending permit will not be processed.</w:t>
+        <w:t>No more than two food trucks per block.</w:t>
       </w:r>
     </w:p>
     <w:p>
       <w:r>
-        <w:t>been convicted of any of the following offences under the highway traffic act in the preceding five years:</w:t>
+        <w:t>Green p parking lots (with a green p permit) contact: events@greenpmobility.com</w:t>
       </w:r>
     </w:p>
     <w:p>
       <w:r>
-        <w:t>maximum of five hours at any one time</w:t>
+        <w:t>If you have already submitted an application and a representative has contacted you about uploading additional documents, you may do so using the upload token provided to you by the representative.</w:t>
       </w:r>
     </w:p>
     <w:p>
       <w:r>
-        <w:t>private property and commercial parking lots with the permission of the owner in areas that allow food trucks</w:t>
+        <w:t>You can arrange this by calling 311 or the health connection line at 416-338-7600.</w:t>
       </w:r>
     </w:p>
     <w:p>
       <w:r>
-        <w:t>30 linear metres from an open and operating restaurant</w:t>
+        <w:t>Ml&amp;s shall deny an application for, or a renewal for any business, trade or calling for which a vehicle and it’s driver are licenced or required to be licenced by the city under this chapter and for which a licencesee is required to hold a valid provincial driver’s licence under this chapter where the licensee or applicant has:.</w:t>
       </w:r>
     </w:p>
     <w:p>
       <w:r>
-        <w:t>no more than two food trucks per block</w:t>
+        <w:t>A copy of articles of incorporation (certificate and articles) (note: if there has been a change to the list of officers and directors, please provide a current corporate profile report);.</w:t>
       </w:r>
     </w:p>
     <w:p>
       <w:r>
-        <w:t>green p parking lots (with a green p permit) contact: events@greenpmobility.com</w:t>
+        <w:t>The annual return for corporation form, signed by an officer or director pdf, which lists all current directors &amp; officers of the corporation;.</w:t>
       </w:r>
     </w:p>
     <w:p>
       <w:r>
-        <w:t>if you have already submitted an application and a representative has contacted you about uploading additional documents, you may do so using the upload token provided to you by the representative.</w:t>
+        <w:t>Two pieces of government-issued identification (one must be photo id) for each officer/director;.</w:t>
       </w:r>
     </w:p>
     <w:p>
       <w:r>
-        <w:t>you can arrange this by calling 311 or the health connection line at 416-338-7600.</w:t>
+        <w:t>A criminal record and judicial matters check for each officer/director issued by a canadian police service within 280 days prior to the application.</w:t>
       </w:r>
     </w:p>
     <w:p>
       <w:r>
-        <w:t>ml&amp;s shall deny an application for, or a renewal for any business, trade or calling for which a vehicle and it’s driver are licenced or required to be licenced by the city under this chapter and for which a licencesee is required to hold a valid provincial driver’s licence under this chapter where the licensee or applicant has:</w:t>
+        <w:t>In-person services are available at the licence and permit issuing office, 850 coxwell avenue, 3rd floor.</w:t>
       </w:r>
     </w:p>
     <w:p>
       <w:r>
-        <w:t>a copy of articles of incorporation (certificate and articles) (note: if there has been a change to the list of officers and directors, please provide a current corporate profile report);</w:t>
+        <w:t>The office is closed from 12:30pm – 1:30pm daily.</w:t>
       </w:r>
     </w:p>
     <w:p>
       <w:r>
-        <w:t>the annual return for corporation form, signed by an officer or director pdf, which lists all current directors &amp; officers of the corporation;</w:t>
+        <w:t>Please note office hours:.</w:t>
       </w:r>
     </w:p>
     <w:p>
       <w:r>
-        <w:t>two pieces of government-issued identification (one must be photo id) for each officer/director;</w:t>
+        <w:t>The office is closed from 12:30–1:30pm daily.</w:t>
       </w:r>
     </w:p>
     <w:p>
       <w:r>
-        <w:t>a criminal record and judicial matters check for each officer/director issued by a canadian police service within 280 days prior to the application.</w:t>
+        <w:t>Failing to stop for a school bus or when signaled or asked by a police officer;.</w:t>
       </w:r>
     </w:p>
     <w:p>
       <w:r>
-        <w:t>in-person services are available at the licence and permit issuing office, 850 coxwell avenue, 3rd floor.</w:t>
+        <w:t>Walk-in renewal services are available monday, wednesday and thursday at the licence and permit issuing office, 850 coxwell avenue, 3rd floor starting at 8:30am subject to capacity.</w:t>
       </w:r>
     </w:p>
     <w:p>
       <w:r>
-        <w:t>the office is closed from 12:30pm – 1:30pm daily.</w:t>
+        <w:t>Despite these screening criteria, if a licence has been previously issued or renewed and the applicant’s or licensee’s record discloses no new breach of the screening criteria, the licence may be issued or renewed without the matter being referred to the toronto licensing tribunal.</w:t>
       </w:r>
     </w:p>
     <w:p>
       <w:r>
-        <w:t>please note office hours:</w:t>
+        <w:t>Sin card (social insurance number).</w:t>
       </w:r>
     </w:p>
     <w:p>
       <w:r>
-        <w:t>the office is closed from 12:30–1:30pm daily.</w:t>
+        <w:t>A completed and signed certificate of insurance.</w:t>
       </w:r>
     </w:p>
     <w:p>
       <w:r>
-        <w:t>failing to stop for a school bus or when signaled or asked by a police officer;</w:t>
+        <w:t>Applicants must provide proof of $1,000,000 insurance personal liability &amp; property damage (pl/pd) insurance..</w:t>
       </w:r>
     </w:p>
     <w:p>
       <w:r>
-        <w:t>walk-in renewal services are available monday, wednesday and thursday at the licence and permit issuing office, 850 coxwell avenue, 3rd floor starting at 8:30am subject to capacity.</w:t>
+        <w:t>The completed certificate of insurance  pdfmust be signed and stamped by the insurer.</w:t>
       </w:r>
     </w:p>
     <w:p>
       <w:r>
-        <w:t>despite these screening criteria, if a licence has been previously issued or renewed and the applicant’s or licensee’s record discloses no new breach of the screening criteria, the licence may be issued or renewed without the matter being referred to the toronto licensing tribunal.</w:t>
+        <w:t>Applicants must provide proof of $2,000,000 in commercial general liability (cgl) insurance..</w:t>
       </w:r>
     </w:p>
     <w:p>
       <w:r>
-        <w:t>sin card (social insurance number)</w:t>
+        <w:t>The completed certificate of insurance pdf must be signed and stamped by the insurer.</w:t>
       </w:r>
     </w:p>
     <w:p>
       <w:r>
-        <w:t>a completed and signed certificate of insurance.</w:t>
+        <w:t>Certificate of insurance pdf.</w:t>
       </w:r>
     </w:p>
     <w:p>
       <w:r>
-        <w:t>certificate of insurance</w:t>
+        <w:t>Business name: 10 cm.</w:t>
       </w:r>
     </w:p>
     <w:p>
       <w:r>
-        <w:t>applicants must provide proof of $1,000,000 insurance personal liability &amp; property damage (pl/pd) insurance.</w:t>
+        <w:t>Plate number: 15 cm.</w:t>
       </w:r>
     </w:p>
     <w:p>
       <w:r>
-        <w:t>the completed certificate of insurance  pdfmust be signed and stamped by the insurer.</w:t>
-      </w:r>
-    </w:p>
-    <w:p>
-      <w:r>
-        <w:t>insurance</w:t>
-      </w:r>
-    </w:p>
-    <w:p>
-      <w:r>
-        <w:t>applicants must provide proof of $2,000,000 in commercial general liability (cgl) insurance.</w:t>
-      </w:r>
-    </w:p>
-    <w:p>
-      <w:r>
-        <w:t>the completed certificate of insurance pdf must be signed and stamped by the insurer.</w:t>
-      </w:r>
-    </w:p>
-    <w:p>
-      <w:r>
-        <w:t>certificate of insurance pdf</w:t>
-      </w:r>
-    </w:p>
-    <w:p>
-      <w:r>
-        <w:t>business name: 10 cm.</w:t>
-      </w:r>
-    </w:p>
-    <w:p>
-      <w:r>
-        <w:t>plate number: 15 cm.</w:t>
-      </w:r>
-    </w:p>
-    <w:p>
-      <w:r>
-        <w:t>painted with contrasting colours on both sides of vehicle</w:t>
+        <w:t>Painted with contrasting colours on both sides of vehicle.</w:t>
       </w:r>
     </w:p>
     <w:p>

</xml_diff>